<commit_message>
Tone down data-room spoilers and set programme window 26 Jul–20 Sep.
Replace pre-rated reliability and Watch-for hints with interrogation prompts; stretch deliverables across eight working weeks ending 20 September.

Co-authored-by: Cursor <cursoragent@cursor.com>
</commit_message>
<xml_diff>
--- a/Answer_Key/Word/02_Expected_Deliverables_and_Outcomes.docx
+++ b/Answer_Key/Word/02_Expected_Deliverables_and_Outcomes.docx
@@ -174,7 +174,7 @@
                 <w:color w:val="222222"/>
                 <w:sz w:val="20"/>
               </w:rPr>
-              <w:t>3.0 | July 2026</w:t>
+              <w:t>3.1 | July-September 2026</w:t>
             </w:r>
           </w:p>
         </w:tc>
@@ -373,7 +373,7 @@
                 <w:rFonts w:ascii="Nunito" w:hAnsi="Nunito" w:eastAsia="Nunito" w:cs="Nunito"/>
                 <w:sz w:val="20"/>
               </w:rPr>
-              <w:t>Tue 14 Jul</w:t>
+              <w:t>Wed 29 Jul</w:t>
             </w:r>
           </w:p>
         </w:tc>
@@ -401,7 +401,7 @@
                 <w:rFonts w:ascii="Nunito" w:hAnsi="Nunito" w:eastAsia="Nunito" w:cs="Nunito"/>
                 <w:sz w:val="20"/>
               </w:rPr>
-              <w:t>Charter signed; RACI has one accountable owner; A/B data rule stated.</w:t>
+              <w:t>Charter confirmed; RACI has one accountable owner; A/B data rule stated.</w:t>
             </w:r>
           </w:p>
         </w:tc>
@@ -415,7 +415,7 @@
                 <w:rFonts w:ascii="Nunito" w:hAnsi="Nunito" w:eastAsia="Nunito" w:cs="Nunito"/>
                 <w:sz w:val="20"/>
               </w:rPr>
-              <w:t>Missing signatures; vague scope; no named WF-A/WF-B leads.</w:t>
+              <w:t>Missing confirmations; vague scope; no named WF-A/WF-B leads.</w:t>
             </w:r>
           </w:p>
         </w:tc>
@@ -462,7 +462,7 @@
                 <w:rFonts w:ascii="Nunito" w:hAnsi="Nunito" w:eastAsia="Nunito" w:cs="Nunito"/>
                 <w:sz w:val="20"/>
               </w:rPr>
-              <w:t>Wed 15 Jul</w:t>
+              <w:t>Wed 5 Aug</w:t>
             </w:r>
           </w:p>
         </w:tc>
@@ -551,7 +551,7 @@
                 <w:rFonts w:ascii="Nunito" w:hAnsi="Nunito" w:eastAsia="Nunito" w:cs="Nunito"/>
                 <w:sz w:val="20"/>
               </w:rPr>
-              <w:t>Thu 16 Jul</w:t>
+              <w:t>Thu 6 Aug</w:t>
             </w:r>
           </w:p>
         </w:tc>
@@ -640,7 +640,7 @@
                 <w:rFonts w:ascii="Nunito" w:hAnsi="Nunito" w:eastAsia="Nunito" w:cs="Nunito"/>
                 <w:sz w:val="20"/>
               </w:rPr>
-              <w:t>Thu 16 Jul</w:t>
+              <w:t>Thu 6 Aug</w:t>
             </w:r>
           </w:p>
         </w:tc>
@@ -670,7 +670,7 @@
                 <w:rFonts w:ascii="Nunito" w:hAnsi="Nunito" w:eastAsia="Nunito" w:cs="Nunito"/>
                 <w:sz w:val="20"/>
               </w:rPr>
-              <w:t>D-02 and D-12 rated high; D-08 rated low; contradictions noted.</w:t>
+              <w:t>Ratings differ by source type; justifications cite audience/incentive/definitions; contradictions noted.</w:t>
             </w:r>
           </w:p>
         </w:tc>
@@ -685,7 +685,7 @@
                 <w:rFonts w:ascii="Nunito" w:hAnsi="Nunito" w:eastAsia="Nunito" w:cs="Nunito"/>
                 <w:sz w:val="20"/>
               </w:rPr>
-              <w:t>All sources rated 'high'; no justification.</w:t>
+              <w:t>All sources rated 'high' with no justification; copied from a facilitator hint.</w:t>
             </w:r>
           </w:p>
         </w:tc>
@@ -729,7 +729,7 @@
                 <w:rFonts w:ascii="Nunito" w:hAnsi="Nunito" w:eastAsia="Nunito" w:cs="Nunito"/>
                 <w:sz w:val="20"/>
               </w:rPr>
-              <w:t>Weeks 2-4</w:t>
+              <w:t>Weeks 3-5</w:t>
             </w:r>
           </w:p>
         </w:tc>
@@ -818,7 +818,7 @@
                 <w:rFonts w:ascii="Nunito" w:hAnsi="Nunito" w:eastAsia="Nunito" w:cs="Nunito"/>
                 <w:sz w:val="20"/>
               </w:rPr>
-              <w:t>Tue 21 Jul</w:t>
+              <w:t>Tue 11 Aug</w:t>
             </w:r>
           </w:p>
         </w:tc>
@@ -907,7 +907,7 @@
                 <w:rFonts w:ascii="Nunito" w:hAnsi="Nunito" w:eastAsia="Nunito" w:cs="Nunito"/>
                 <w:sz w:val="20"/>
               </w:rPr>
-              <w:t>Weeks 2-4</w:t>
+              <w:t>Weeks 3-5</w:t>
             </w:r>
           </w:p>
         </w:tc>
@@ -996,7 +996,7 @@
                 <w:rFonts w:ascii="Nunito" w:hAnsi="Nunito" w:eastAsia="Nunito" w:cs="Nunito"/>
                 <w:sz w:val="20"/>
               </w:rPr>
-              <w:t>Wed 22 Jul</w:t>
+              <w:t>Wed 12 Aug</w:t>
             </w:r>
           </w:p>
         </w:tc>
@@ -1085,7 +1085,7 @@
                 <w:rFonts w:ascii="Nunito" w:hAnsi="Nunito" w:eastAsia="Nunito" w:cs="Nunito"/>
                 <w:sz w:val="20"/>
               </w:rPr>
-              <w:t>Wed 22 Jul</w:t>
+              <w:t>Wed 12 Aug</w:t>
             </w:r>
           </w:p>
         </w:tc>
@@ -1174,7 +1174,7 @@
                 <w:rFonts w:ascii="Nunito" w:hAnsi="Nunito" w:eastAsia="Nunito" w:cs="Nunito"/>
                 <w:sz w:val="20"/>
               </w:rPr>
-              <w:t>Fri 24 Jul</w:t>
+              <w:t>Fri 14 Aug</w:t>
             </w:r>
           </w:p>
         </w:tc>
@@ -1263,7 +1263,7 @@
                 <w:rFonts w:ascii="Nunito" w:hAnsi="Nunito" w:eastAsia="Nunito" w:cs="Nunito"/>
                 <w:sz w:val="20"/>
               </w:rPr>
-              <w:t>Wed 29 Jul</w:t>
+              <w:t>Wed 19 Aug</w:t>
             </w:r>
           </w:p>
         </w:tc>
@@ -1352,7 +1352,7 @@
                 <w:rFonts w:ascii="Nunito" w:hAnsi="Nunito" w:eastAsia="Nunito" w:cs="Nunito"/>
                 <w:sz w:val="20"/>
               </w:rPr>
-              <w:t>Thu 30 Jul</w:t>
+              <w:t>Thu 20 Aug</w:t>
             </w:r>
           </w:p>
         </w:tc>
@@ -1441,7 +1441,7 @@
                 <w:rFonts w:ascii="Nunito" w:hAnsi="Nunito" w:eastAsia="Nunito" w:cs="Nunito"/>
                 <w:sz w:val="20"/>
               </w:rPr>
-              <w:t>Fri 31 Jul</w:t>
+              <w:t>Fri 21 Aug</w:t>
             </w:r>
           </w:p>
         </w:tc>
@@ -1530,7 +1530,7 @@
                 <w:rFonts w:ascii="Nunito" w:hAnsi="Nunito" w:eastAsia="Nunito" w:cs="Nunito"/>
                 <w:sz w:val="20"/>
               </w:rPr>
-              <w:t>Wed 5 Aug</w:t>
+              <w:t>Wed 26 Aug</w:t>
             </w:r>
           </w:p>
         </w:tc>
@@ -1619,7 +1619,7 @@
                 <w:rFonts w:ascii="Nunito" w:hAnsi="Nunito" w:eastAsia="Nunito" w:cs="Nunito"/>
                 <w:sz w:val="20"/>
               </w:rPr>
-              <w:t>Wed 5 Aug</w:t>
+              <w:t>Wed 26 Aug</w:t>
             </w:r>
           </w:p>
         </w:tc>
@@ -1708,7 +1708,7 @@
                 <w:rFonts w:ascii="Nunito" w:hAnsi="Nunito" w:eastAsia="Nunito" w:cs="Nunito"/>
                 <w:sz w:val="20"/>
               </w:rPr>
-              <w:t>Thu 6 Aug</w:t>
+              <w:t>Thu 27 Aug</w:t>
             </w:r>
           </w:p>
         </w:tc>
@@ -1797,7 +1797,7 @@
                 <w:rFonts w:ascii="Nunito" w:hAnsi="Nunito" w:eastAsia="Nunito" w:cs="Nunito"/>
                 <w:sz w:val="20"/>
               </w:rPr>
-              <w:t>Thu 6 Aug</w:t>
+              <w:t>Thu 27 Aug</w:t>
             </w:r>
           </w:p>
         </w:tc>
@@ -1886,7 +1886,7 @@
                 <w:rFonts w:ascii="Nunito" w:hAnsi="Nunito" w:eastAsia="Nunito" w:cs="Nunito"/>
                 <w:sz w:val="20"/>
               </w:rPr>
-              <w:t>Fri 7 Aug</w:t>
+              <w:t>Fri 28 Aug</w:t>
             </w:r>
           </w:p>
         </w:tc>
@@ -1975,7 +1975,7 @@
                 <w:rFonts w:ascii="Nunito" w:hAnsi="Nunito" w:eastAsia="Nunito" w:cs="Nunito"/>
                 <w:sz w:val="20"/>
               </w:rPr>
-              <w:t>Fri 14 Aug</w:t>
+              <w:t>Fri 11 Sep</w:t>
             </w:r>
           </w:p>
         </w:tc>
@@ -2064,7 +2064,7 @@
                 <w:rFonts w:ascii="Nunito" w:hAnsi="Nunito" w:eastAsia="Nunito" w:cs="Nunito"/>
                 <w:sz w:val="20"/>
               </w:rPr>
-              <w:t>Thu 13 Aug</w:t>
+              <w:t>Thu 10 Sep</w:t>
             </w:r>
           </w:p>
         </w:tc>
@@ -2153,7 +2153,7 @@
                 <w:rFonts w:ascii="Nunito" w:hAnsi="Nunito" w:eastAsia="Nunito" w:cs="Nunito"/>
                 <w:sz w:val="20"/>
               </w:rPr>
-              <w:t>Wed 12 Aug</w:t>
+              <w:t>Wed 2 Sep</w:t>
             </w:r>
           </w:p>
         </w:tc>
@@ -2181,7 +2181,7 @@
                 <w:rFonts w:ascii="Nunito" w:hAnsi="Nunito" w:eastAsia="Nunito" w:cs="Nunito"/>
                 <w:sz w:val="20"/>
               </w:rPr>
-              <w:t>Genuine exchange evidenced; Engagement Lead signs in good faith.</w:t>
+              <w:t>Genuine exchange evidenced; Engagement Lead confirms in good faith.</w:t>
             </w:r>
           </w:p>
         </w:tc>
@@ -2195,7 +2195,7 @@
                 <w:rFonts w:ascii="Nunito" w:hAnsi="Nunito" w:eastAsia="Nunito" w:cs="Nunito"/>
                 <w:sz w:val="20"/>
               </w:rPr>
-              <w:t>One dump at the end; raw file shared; unsigned.</w:t>
+              <w:t>One dump at the end; raw file shared; unchecked.</w:t>
             </w:r>
           </w:p>
         </w:tc>
@@ -2223,7 +2223,7 @@
           <w:rFonts w:ascii="Lexend" w:hAnsi="Lexend" w:eastAsia="Lexend" w:cs="Lexend"/>
           <w:color w:val="1B2A4A"/>
         </w:rPr>
-        <w:t>Project Charter (All, due Tue 14 Jul)</w:t>
+        <w:t>Project Charter (All, due Wed 29 Jul)</w:t>
       </w:r>
     </w:p>
     <w:p>
@@ -2238,7 +2238,7 @@
           <w:color w:val="222222"/>
           <w:sz w:val="22"/>
         </w:rPr>
-        <w:t>Requirement: Team names, roles, scope, request protocol agreed, all signatures by deadline.</w:t>
+        <w:t>Requirement: Team names, roles, scope, request protocol agreed, online confirm by deadline.</w:t>
       </w:r>
     </w:p>
     <w:p>
@@ -2253,7 +2253,7 @@
           <w:color w:val="222222"/>
           <w:sz w:val="22"/>
         </w:rPr>
-        <w:t>Excellent: Charter signed; RACI has one accountable owner; A/B data rule stated.</w:t>
+        <w:t>Excellent: Charter confirmed; RACI has one accountable owner; A/B data rule stated.</w:t>
       </w:r>
     </w:p>
     <w:p>
@@ -2268,7 +2268,7 @@
           <w:color w:val="222222"/>
           <w:sz w:val="22"/>
         </w:rPr>
-        <w:t>Mark down if: Missing signatures; vague scope; no named WF-A/WF-B leads.</w:t>
+        <w:t>Mark down if: Missing confirmations; vague scope; no named WF-A/WF-B leads.</w:t>
       </w:r>
     </w:p>
     <w:p>
@@ -2280,7 +2280,7 @@
           <w:rFonts w:ascii="Lexend" w:hAnsi="Lexend" w:eastAsia="Lexend" w:cs="Lexend"/>
           <w:color w:val="1B2A4A"/>
         </w:rPr>
-        <w:t>A1 - Problem statement and issue tree (A, due Wed 15 Jul)</w:t>
+        <w:t>A1 - Problem statement and issue tree (A, due Wed 5 Aug)</w:t>
       </w:r>
     </w:p>
     <w:p>
@@ -2337,7 +2337,7 @@
           <w:rFonts w:ascii="Lexend" w:hAnsi="Lexend" w:eastAsia="Lexend" w:cs="Lexend"/>
           <w:color w:val="1B2A4A"/>
         </w:rPr>
-        <w:t>A1b - Stakeholder map (A, due Thu 16 Jul)</w:t>
+        <w:t>A1b - Stakeholder map (A, due Thu 6 Aug)</w:t>
       </w:r>
     </w:p>
     <w:p>
@@ -2394,7 +2394,7 @@
           <w:rFonts w:ascii="Lexend" w:hAnsi="Lexend" w:eastAsia="Lexend" w:cs="Lexend"/>
           <w:color w:val="1B2A4A"/>
         </w:rPr>
-        <w:t>Credibility matrix (All, due Thu 16 Jul)</w:t>
+        <w:t>Credibility matrix (All, due Thu 6 Aug)</w:t>
       </w:r>
     </w:p>
     <w:p>
@@ -2409,7 +2409,7 @@
           <w:color w:val="222222"/>
           <w:sz w:val="22"/>
         </w:rPr>
-        <w:t>Requirement: Every shared D-01 to D-12 source rated H/M/L; Findings Memos rated once received.</w:t>
+        <w:t>Requirement: Every shared D-01 to D-12 source rated H/M/L with justification; Findings Memos rated once received.</w:t>
       </w:r>
     </w:p>
     <w:p>
@@ -2424,7 +2424,7 @@
           <w:color w:val="222222"/>
           <w:sz w:val="22"/>
         </w:rPr>
-        <w:t>Excellent: D-02 and D-12 rated high; D-08 rated low; contradictions noted.</w:t>
+        <w:t>Excellent: Ratings differ by source type; justifications cite audience/incentive/definitions; contradictions noted.</w:t>
       </w:r>
     </w:p>
     <w:p>
@@ -2439,7 +2439,7 @@
           <w:color w:val="222222"/>
           <w:sz w:val="22"/>
         </w:rPr>
-        <w:t>Mark down if: All sources rated 'high'; no justification.</w:t>
+        <w:t>Mark down if: All sources rated 'high' with no justification; copied from a facilitator hint.</w:t>
       </w:r>
     </w:p>
     <w:p>
@@ -2451,7 +2451,7 @@
           <w:rFonts w:ascii="Lexend" w:hAnsi="Lexend" w:eastAsia="Lexend" w:cs="Lexend"/>
           <w:color w:val="1B2A4A"/>
         </w:rPr>
-        <w:t>Analysis Requests (min. 3) (A, due Weeks 2-4)</w:t>
+        <w:t>Analysis Requests (min. 3) (A, due Weeks 3-5)</w:t>
       </w:r>
     </w:p>
     <w:p>
@@ -2508,7 +2508,7 @@
           <w:rFonts w:ascii="Lexend" w:hAnsi="Lexend" w:eastAsia="Lexend" w:cs="Lexend"/>
           <w:color w:val="1B2A4A"/>
         </w:rPr>
-        <w:t>B1 - Data quality report (B, due Tue 21 Jul)</w:t>
+        <w:t>B1 - Data quality report (B, due Tue 11 Aug)</w:t>
       </w:r>
     </w:p>
     <w:p>
@@ -2565,7 +2565,7 @@
           <w:rFonts w:ascii="Lexend" w:hAnsi="Lexend" w:eastAsia="Lexend" w:cs="Lexend"/>
           <w:color w:val="1B2A4A"/>
         </w:rPr>
-        <w:t>Findings Memos (min. 3) (B, due Weeks 2-4)</w:t>
+        <w:t>Findings Memos (min. 3) (B, due Weeks 3-5)</w:t>
       </w:r>
     </w:p>
     <w:p>
@@ -2622,7 +2622,7 @@
           <w:rFonts w:ascii="Lexend" w:hAnsi="Lexend" w:eastAsia="Lexend" w:cs="Lexend"/>
           <w:color w:val="1B2A4A"/>
         </w:rPr>
-        <w:t>A2 - Interview synthesis (A, due Wed 22 Jul)</w:t>
+        <w:t>A2 - Interview synthesis (A, due Wed 12 Aug)</w:t>
       </w:r>
     </w:p>
     <w:p>
@@ -2679,7 +2679,7 @@
           <w:rFonts w:ascii="Lexend" w:hAnsi="Lexend" w:eastAsia="Lexend" w:cs="Lexend"/>
           <w:color w:val="1B2A4A"/>
         </w:rPr>
-        <w:t>A3 - Empathy and journey maps (A, due Wed 22 Jul)</w:t>
+        <w:t>A3 - Empathy and journey maps (A, due Wed 12 Aug)</w:t>
       </w:r>
     </w:p>
     <w:p>
@@ -2736,7 +2736,7 @@
           <w:rFonts w:ascii="Lexend" w:hAnsi="Lexend" w:eastAsia="Lexend" w:cs="Lexend"/>
           <w:color w:val="1B2A4A"/>
         </w:rPr>
-        <w:t>B2 - Performance dashboard (B, due Fri 24 Jul)</w:t>
+        <w:t>B2 - Performance dashboard (B, due Fri 14 Aug)</w:t>
       </w:r>
     </w:p>
     <w:p>
@@ -2793,7 +2793,7 @@
           <w:rFonts w:ascii="Lexend" w:hAnsi="Lexend" w:eastAsia="Lexend" w:cs="Lexend"/>
           <w:color w:val="1B2A4A"/>
         </w:rPr>
-        <w:t>B3 - Analysis summary (B, due Wed 29 Jul)</w:t>
+        <w:t>B3 - Analysis summary (B, due Wed 19 Aug)</w:t>
       </w:r>
     </w:p>
     <w:p>
@@ -2850,7 +2850,7 @@
           <w:rFonts w:ascii="Lexend" w:hAnsi="Lexend" w:eastAsia="Lexend" w:cs="Lexend"/>
           <w:color w:val="1B2A4A"/>
         </w:rPr>
-        <w:t>A4 - Strategic options (A, due Thu 30 Jul)</w:t>
+        <w:t>A4 - Strategic options (A, due Thu 20 Aug)</w:t>
       </w:r>
     </w:p>
     <w:p>
@@ -2907,7 +2907,7 @@
           <w:rFonts w:ascii="Lexend" w:hAnsi="Lexend" w:eastAsia="Lexend" w:cs="Lexend"/>
           <w:color w:val="1B2A4A"/>
         </w:rPr>
-        <w:t>B4 - Evidence-check memo (B, due Fri 31 Jul)</w:t>
+        <w:t>B4 - Evidence-check memo (B, due Fri 21 Aug)</w:t>
       </w:r>
     </w:p>
     <w:p>
@@ -2964,7 +2964,7 @@
           <w:rFonts w:ascii="Lexend" w:hAnsi="Lexend" w:eastAsia="Lexend" w:cs="Lexend"/>
           <w:color w:val="1B2A4A"/>
         </w:rPr>
-        <w:t>A5 - Trade-off reflection (A, due Wed 5 Aug)</w:t>
+        <w:t>A5 - Trade-off reflection (A, due Wed 26 Aug)</w:t>
       </w:r>
     </w:p>
     <w:p>
@@ -3021,7 +3021,7 @@
           <w:rFonts w:ascii="Lexend" w:hAnsi="Lexend" w:eastAsia="Lexend" w:cs="Lexend"/>
           <w:color w:val="1B2A4A"/>
         </w:rPr>
-        <w:t>A6 - Validation protocol (All, due Wed 5 Aug)</w:t>
+        <w:t>A6 - Validation protocol (All, due Wed 26 Aug)</w:t>
       </w:r>
     </w:p>
     <w:p>
@@ -3078,7 +3078,7 @@
           <w:rFonts w:ascii="Lexend" w:hAnsi="Lexend" w:eastAsia="Lexend" w:cs="Lexend"/>
           <w:color w:val="1B2A4A"/>
         </w:rPr>
-        <w:t>B5 - Funding scenarios (B, due Thu 6 Aug)</w:t>
+        <w:t>B5 - Funding scenarios (B, due Thu 27 Aug)</w:t>
       </w:r>
     </w:p>
     <w:p>
@@ -3135,7 +3135,7 @@
           <w:rFonts w:ascii="Lexend" w:hAnsi="Lexend" w:eastAsia="Lexend" w:cs="Lexend"/>
           <w:color w:val="1B2A4A"/>
         </w:rPr>
-        <w:t>A7 - Revision log (All, due Thu 6 Aug)</w:t>
+        <w:t>A7 - Revision log (All, due Thu 27 Aug)</w:t>
       </w:r>
     </w:p>
     <w:p>
@@ -3192,7 +3192,7 @@
           <w:rFonts w:ascii="Lexend" w:hAnsi="Lexend" w:eastAsia="Lexend" w:cs="Lexend"/>
           <w:color w:val="1B2A4A"/>
         </w:rPr>
-        <w:t>Executive summary (All, due Fri 7 Aug)</w:t>
+        <w:t>Executive summary (All, due Fri 28 Aug)</w:t>
       </w:r>
     </w:p>
     <w:p>
@@ -3249,7 +3249,7 @@
           <w:rFonts w:ascii="Lexend" w:hAnsi="Lexend" w:eastAsia="Lexend" w:cs="Lexend"/>
           <w:color w:val="1B2A4A"/>
         </w:rPr>
-        <w:t>Final report (All, due Fri 14 Aug)</w:t>
+        <w:t>Final report (All, due Fri 11 Sep)</w:t>
       </w:r>
     </w:p>
     <w:p>
@@ -3306,7 +3306,7 @@
           <w:rFonts w:ascii="Lexend" w:hAnsi="Lexend" w:eastAsia="Lexend" w:cs="Lexend"/>
           <w:color w:val="1B2A4A"/>
         </w:rPr>
-        <w:t>Board presentation (All, due Thu 13 Aug)</w:t>
+        <w:t>Board presentation (All, due Thu 10 Sep)</w:t>
       </w:r>
     </w:p>
     <w:p>
@@ -3363,7 +3363,7 @@
           <w:rFonts w:ascii="Lexend" w:hAnsi="Lexend" w:eastAsia="Lexend" w:cs="Lexend"/>
           <w:color w:val="1B2A4A"/>
         </w:rPr>
-        <w:t>Handoff checklist (All, due Wed 12 Aug)</w:t>
+        <w:t>Handoff checklist (All, due Wed 2 Sep)</w:t>
       </w:r>
     </w:p>
     <w:p>
@@ -3378,7 +3378,7 @@
           <w:color w:val="222222"/>
           <w:sz w:val="22"/>
         </w:rPr>
-        <w:t>Requirement: Both sections signed; Request Log shows min. three completed pairs.</w:t>
+        <w:t>Requirement: Both sections online-confirmed; Request Log shows min. three completed pairs.</w:t>
       </w:r>
     </w:p>
     <w:p>
@@ -3393,7 +3393,7 @@
           <w:color w:val="222222"/>
           <w:sz w:val="22"/>
         </w:rPr>
-        <w:t>Excellent: Genuine exchange evidenced; Engagement Lead signs in good faith.</w:t>
+        <w:t>Excellent: Genuine exchange evidenced; Engagement Lead confirms in good faith.</w:t>
       </w:r>
     </w:p>
     <w:p>
@@ -3408,7 +3408,7 @@
           <w:color w:val="222222"/>
           <w:sz w:val="22"/>
         </w:rPr>
-        <w:t>Mark down if: One dump at the end; raw file shared; unsigned.</w:t>
+        <w:t>Mark down if: One dump at the end; raw file shared; unchecked.</w:t>
       </w:r>
     </w:p>
     <w:p>

</xml_diff>